<commit_message>
feat(datepicker): chuẩn hóa định dạng dd/mm/yyyy và cơ chế rào tháng nhập liệu
- SingleDatePicker & DateRangePicker:
  + Tự động chèn dấu gạch chéo / trực quan ngay khi nhập xong ngày (2 chữ số) và tháng (2 chữ số).
  + Yêu cầu nhập đủ 8 chữ số (ddmmyyyy) mới thực hiện chuyển đổi sang ngày hoàn chỉnh, không tự chuyển khi mới nhập 6 chữ số.
  + Thiết lập giới hạn tháng nhập liệu tối đa 12 tháng (01 đến 12).
  + Xử lý trường hợp số đầu tiên ở phần tháng lớn hơn 1 (từ 2 đến 9): tự động chuẩn hóa thành 0X/ và nhảy ngay sang vị trí nhập năm.
  + Bổ sung thuộc tính fourDigitYear hiển thị đủ 4 số năm (dd/mm/yyyy) và truyền prop :start-date ưu tiên tháng của ngày hệ thống.
  + Cập nhật quy chuẩn nhập liệu ngày tháng vào FE Design System và tài liệu đặc tả dự án.
</commit_message>
<xml_diff>
--- a/file word can len plan/Lỗi liên quan tới khóa phòng.docx
+++ b/file word can len plan/Lỗi liên quan tới khóa phòng.docx
@@ -899,6 +899,64 @@
       </w:r>
       <w:bookmarkStart w:id="0" w:name="_GoBack"/>
       <w:bookmarkEnd w:id="0"/>
+    </w:p>
+    <w:p>
+      <w:r>
+        <w:t>Section 5</w:t>
+      </w:r>
+    </w:p>
+    <w:p>
+      <w:r>
+        <w:t>Quy chuẩn định dạng ngày tháng:</w:t>
+      </w:r>
+    </w:p>
+    <w:p>
+      <w:r>
+        <w:t>- Các ô ngày tháng bắt buộc theo định dạng dd/mm/yyyy.</w:t>
+      </w:r>
+    </w:p>
+    <w:p>
+      <w:r>
+        <w:t>- Khi người dùng nhập tay các ô ngày tháng, bắt buộc phải nhập đủ 8 chữ số (ddmmyyyy) mới tự động chuyển đổi sang dạng dd/mm/yyyy.</w:t>
+      </w:r>
+    </w:p>
+    <w:p>
+      <w:r>
+        <w:t>- Tuyệt đối không tự động chuyển đổi khi mới nhập 6 chữ số (ddmmyy) để tránh lỗi tự động format sớm khi người dùng đang nhập năm 4 chữ số.</w:t>
+        <w:br/>
+        <w:t>- Khi nhập ngày (2 số) và tháng (2 số) xong, tự động hiện dấu gạch chéo / ngay lập tức để người dùng nhận biết đang nhập tới đâu (VD: gõ 18 thành 18/, gõ tiếp 12 thành 18/12/).</w:t>
+      </w:r>
+    </w:p>
+    <w:p>
+      <w:r>
+        <w:t>- Giới hạn tháng chỉ được nhập tối đa 12 tháng (01 đến 12). Nếu số đầu tiên ở phần tháng lớn hơn 1 (các số 2 đến 9) thì hệ thống tự động chuẩn hóa thành 0X/ và chuyển sang vị trí nhập năm luôn (ví dụ: đang ở 18/, gõ số 5 thì tháng tự thành 05 và hiển thị 18/05/ rồi nhảy qua cho nhập năm luôn).</w:t>
+      </w:r>
+    </w:p>
+    <w:p/>
+    <w:p>
+      <w:r>
+        <w:t>Section 6</w:t>
+      </w:r>
+    </w:p>
+    <w:p>
+      <w:r>
+        <w:t>Quy chuẩn form/modal di chuyển được:</w:t>
+      </w:r>
+    </w:p>
+    <w:p>
+      <w:r>
+        <w:t>- Tất cả form và modal phải hỗ trợ kéo-thả bằng chuột qua thanh tiêu đề.</w:t>
+      </w:r>
+    </w:p>
+    <w:p>
+      <w:r>
+        <w:t>- Vị trí sau khi kéo phải được giới hạn trong viewport, không tràn khỏi màn hình.</w:t>
+      </w:r>
+    </w:p>
+    <w:p>
+      <w:r>
+        <w:t>- Kéo-thả chỉ thay đổi vị trí hiển thị; không thay đổi dữ liệu, API hoặc trạng thái nghiệp vụ.</w:t>
+      </w:r>
     </w:p>
     <w:sectPr>
       <w:pgSz w:w="11906" w:h="16838"/>

</xml_diff>